<commit_message>
Corrected: space between the rows set to 1.5, images' size corrected to normal viewable, demonstration of custom function from LR2 added, literature added
</commit_message>
<xml_diff>
--- a/Исправления 1 и 2.docx
+++ b/Исправления 1 и 2.docx
@@ -38,7 +38,8 @@
       </w:pPr>
       <w:r>
         <w:rPr>
-          <w:lang w:val="en-US"/>
+          <w:noProof/>
+          <w:lang w:eastAsia="ru-RU"/>
         </w:rPr>
         <w:drawing>
           <wp:inline distT="0" distB="0" distL="0" distR="0" wp14:anchorId="1E604470" wp14:editId="3CDD2B91">
@@ -100,16 +101,18 @@
         <w:ind w:left="0" w:firstLine="0"/>
         <w:jc w:val="center"/>
       </w:pPr>
-      <w:bookmarkStart w:id="0" w:name="_GoBack"/>
-      <w:bookmarkEnd w:id="0"/>
-    </w:p>
-    <w:p>
-      <w:pPr>
-        <w:pStyle w:val="a4"/>
-        <w:ind w:left="0" w:firstLine="0"/>
-        <w:jc w:val="center"/>
-      </w:pPr>
-      <w:r>
+    </w:p>
+    <w:p>
+      <w:pPr>
+        <w:pStyle w:val="a4"/>
+        <w:ind w:left="0" w:firstLine="0"/>
+        <w:jc w:val="center"/>
+      </w:pPr>
+      <w:r>
+        <w:rPr>
+          <w:noProof/>
+          <w:lang w:eastAsia="ru-RU"/>
+        </w:rPr>
         <w:lastRenderedPageBreak/>
         <w:drawing>
           <wp:inline distT="0" distB="0" distL="0" distR="0" wp14:anchorId="46FFC19A" wp14:editId="1BA745B2">
@@ -161,6 +164,10 @@
         <w:ind w:left="0" w:firstLine="0"/>
       </w:pPr>
       <w:r>
+        <w:rPr>
+          <w:noProof/>
+          <w:lang w:eastAsia="ru-RU"/>
+        </w:rPr>
         <w:drawing>
           <wp:inline distT="0" distB="0" distL="0" distR="0" wp14:anchorId="62265E05" wp14:editId="61972138">
             <wp:extent cx="5940425" cy="2425700"/>
@@ -210,6 +217,455 @@
     </w:p>
     <w:p>
       <w:pPr>
+        <w:spacing w:after="160" w:line="259" w:lineRule="auto"/>
+        <w:ind w:firstLine="0"/>
+        <w:jc w:val="left"/>
+      </w:pPr>
+      <w:r>
+        <w:br w:type="page"/>
+      </w:r>
+    </w:p>
+    <w:p>
+      <w:pPr>
+        <w:pStyle w:val="a4"/>
+        <w:ind w:left="0"/>
+      </w:pPr>
+      <w:r>
+        <w:lastRenderedPageBreak/>
+        <w:t>Пример работы кнопки:</w:t>
+      </w:r>
+    </w:p>
+    <w:p>
+      <w:pPr>
+        <w:pStyle w:val="a4"/>
+        <w:numPr>
+          <w:ilvl w:val="2"/>
+          <w:numId w:val="12"/>
+        </w:numPr>
+        <w:ind w:left="709" w:firstLine="709"/>
+      </w:pPr>
+      <w:r>
+        <w:t>Вводим четыре числа (кнопка их накапливает)</w:t>
+      </w:r>
+    </w:p>
+    <w:p>
+      <w:pPr>
+        <w:pStyle w:val="a4"/>
+        <w:ind w:left="0" w:firstLine="0"/>
+        <w:jc w:val="center"/>
+      </w:pPr>
+      <w:r>
+        <w:drawing>
+          <wp:inline distT="0" distB="0" distL="0" distR="0" wp14:anchorId="252FAE39" wp14:editId="371CCA31">
+            <wp:extent cx="3065991" cy="3480754"/>
+            <wp:effectExtent l="0" t="0" r="1270" b="5715"/>
+            <wp:docPr id="4" name="Рисунок 4"/>
+            <wp:cNvGraphicFramePr>
+              <a:graphicFrameLocks xmlns:a="http://schemas.openxmlformats.org/drawingml/2006/main" noChangeAspect="1"/>
+            </wp:cNvGraphicFramePr>
+            <a:graphic xmlns:a="http://schemas.openxmlformats.org/drawingml/2006/main">
+              <a:graphicData uri="http://schemas.openxmlformats.org/drawingml/2006/picture">
+                <pic:pic xmlns:pic="http://schemas.openxmlformats.org/drawingml/2006/picture">
+                  <pic:nvPicPr>
+                    <pic:cNvPr id="1" name=""/>
+                    <pic:cNvPicPr/>
+                  </pic:nvPicPr>
+                  <pic:blipFill>
+                    <a:blip r:embed="rId8"/>
+                    <a:stretch>
+                      <a:fillRect/>
+                    </a:stretch>
+                  </pic:blipFill>
+                  <pic:spPr>
+                    <a:xfrm>
+                      <a:off x="0" y="0"/>
+                      <a:ext cx="3071691" cy="3487225"/>
+                    </a:xfrm>
+                    <a:prstGeom prst="rect">
+                      <a:avLst/>
+                    </a:prstGeom>
+                  </pic:spPr>
+                </pic:pic>
+              </a:graphicData>
+            </a:graphic>
+          </wp:inline>
+        </w:drawing>
+      </w:r>
+    </w:p>
+    <w:p>
+      <w:pPr>
+        <w:pStyle w:val="a4"/>
+        <w:ind w:left="0" w:firstLine="0"/>
+        <w:jc w:val="center"/>
+      </w:pPr>
+      <w:r>
+        <w:t>Рисунок 3 – Первое значение</w:t>
+      </w:r>
+    </w:p>
+    <w:p>
+      <w:pPr>
+        <w:pStyle w:val="a4"/>
+        <w:ind w:left="0" w:firstLine="0"/>
+        <w:jc w:val="center"/>
+      </w:pPr>
+    </w:p>
+    <w:p>
+      <w:pPr>
+        <w:pStyle w:val="a4"/>
+        <w:ind w:left="0" w:firstLine="0"/>
+        <w:jc w:val="center"/>
+      </w:pPr>
+      <w:r>
+        <w:drawing>
+          <wp:inline distT="0" distB="0" distL="0" distR="0" wp14:anchorId="517E179D" wp14:editId="7D3FAB27">
+            <wp:extent cx="3023658" cy="3449756"/>
+            <wp:effectExtent l="0" t="0" r="5715" b="0"/>
+            <wp:docPr id="5" name="Рисунок 5"/>
+            <wp:cNvGraphicFramePr>
+              <a:graphicFrameLocks xmlns:a="http://schemas.openxmlformats.org/drawingml/2006/main" noChangeAspect="1"/>
+            </wp:cNvGraphicFramePr>
+            <a:graphic xmlns:a="http://schemas.openxmlformats.org/drawingml/2006/main">
+              <a:graphicData uri="http://schemas.openxmlformats.org/drawingml/2006/picture">
+                <pic:pic xmlns:pic="http://schemas.openxmlformats.org/drawingml/2006/picture">
+                  <pic:nvPicPr>
+                    <pic:cNvPr id="1" name=""/>
+                    <pic:cNvPicPr/>
+                  </pic:nvPicPr>
+                  <pic:blipFill>
+                    <a:blip r:embed="rId9"/>
+                    <a:stretch>
+                      <a:fillRect/>
+                    </a:stretch>
+                  </pic:blipFill>
+                  <pic:spPr>
+                    <a:xfrm>
+                      <a:off x="0" y="0"/>
+                      <a:ext cx="3031788" cy="3459032"/>
+                    </a:xfrm>
+                    <a:prstGeom prst="rect">
+                      <a:avLst/>
+                    </a:prstGeom>
+                  </pic:spPr>
+                </pic:pic>
+              </a:graphicData>
+            </a:graphic>
+          </wp:inline>
+        </w:drawing>
+      </w:r>
+    </w:p>
+    <w:p>
+      <w:pPr>
+        <w:pStyle w:val="a4"/>
+        <w:ind w:left="0" w:firstLine="0"/>
+        <w:jc w:val="center"/>
+      </w:pPr>
+      <w:r>
+        <w:t>Рисунок 4</w:t>
+      </w:r>
+      <w:r>
+        <w:t xml:space="preserve"> –</w:t>
+      </w:r>
+      <w:r>
+        <w:t xml:space="preserve"> Второе</w:t>
+      </w:r>
+      <w:r>
+        <w:t xml:space="preserve"> значение</w:t>
+      </w:r>
+    </w:p>
+    <w:p>
+      <w:pPr>
+        <w:pStyle w:val="a4"/>
+        <w:ind w:left="0" w:firstLine="0"/>
+        <w:jc w:val="center"/>
+      </w:pPr>
+    </w:p>
+    <w:p>
+      <w:pPr>
+        <w:pStyle w:val="a4"/>
+        <w:ind w:left="0" w:firstLine="0"/>
+        <w:jc w:val="center"/>
+      </w:pPr>
+      <w:r>
+        <w:lastRenderedPageBreak/>
+        <w:drawing>
+          <wp:inline distT="0" distB="0" distL="0" distR="0" wp14:anchorId="0506D5B2" wp14:editId="65CEFCDC">
+            <wp:extent cx="3162723" cy="3548625"/>
+            <wp:effectExtent l="0" t="0" r="0" b="0"/>
+            <wp:docPr id="6" name="Рисунок 6"/>
+            <wp:cNvGraphicFramePr>
+              <a:graphicFrameLocks xmlns:a="http://schemas.openxmlformats.org/drawingml/2006/main" noChangeAspect="1"/>
+            </wp:cNvGraphicFramePr>
+            <a:graphic xmlns:a="http://schemas.openxmlformats.org/drawingml/2006/main">
+              <a:graphicData uri="http://schemas.openxmlformats.org/drawingml/2006/picture">
+                <pic:pic xmlns:pic="http://schemas.openxmlformats.org/drawingml/2006/picture">
+                  <pic:nvPicPr>
+                    <pic:cNvPr id="1" name=""/>
+                    <pic:cNvPicPr/>
+                  </pic:nvPicPr>
+                  <pic:blipFill>
+                    <a:blip r:embed="rId10"/>
+                    <a:stretch>
+                      <a:fillRect/>
+                    </a:stretch>
+                  </pic:blipFill>
+                  <pic:spPr>
+                    <a:xfrm>
+                      <a:off x="0" y="0"/>
+                      <a:ext cx="3179158" cy="3567066"/>
+                    </a:xfrm>
+                    <a:prstGeom prst="rect">
+                      <a:avLst/>
+                    </a:prstGeom>
+                  </pic:spPr>
+                </pic:pic>
+              </a:graphicData>
+            </a:graphic>
+          </wp:inline>
+        </w:drawing>
+      </w:r>
+    </w:p>
+    <w:p>
+      <w:pPr>
+        <w:pStyle w:val="a4"/>
+        <w:ind w:left="0" w:firstLine="0"/>
+        <w:jc w:val="center"/>
+      </w:pPr>
+      <w:r>
+        <w:t>Рисунок 5</w:t>
+      </w:r>
+      <w:r>
+        <w:t xml:space="preserve"> –</w:t>
+      </w:r>
+      <w:r>
+        <w:t xml:space="preserve"> Третье</w:t>
+      </w:r>
+      <w:r>
+        <w:t xml:space="preserve"> значение</w:t>
+      </w:r>
+    </w:p>
+    <w:p>
+      <w:pPr>
+        <w:pStyle w:val="a4"/>
+        <w:ind w:left="0" w:firstLine="0"/>
+        <w:jc w:val="center"/>
+      </w:pPr>
+    </w:p>
+    <w:p>
+      <w:pPr>
+        <w:pStyle w:val="a4"/>
+        <w:ind w:left="0" w:firstLine="0"/>
+        <w:jc w:val="center"/>
+      </w:pPr>
+      <w:r>
+        <w:drawing>
+          <wp:inline distT="0" distB="0" distL="0" distR="0" wp14:anchorId="18C0D779" wp14:editId="408E3E6F">
+            <wp:extent cx="3016250" cy="3456459"/>
+            <wp:effectExtent l="0" t="0" r="0" b="0"/>
+            <wp:docPr id="7" name="Рисунок 7"/>
+            <wp:cNvGraphicFramePr>
+              <a:graphicFrameLocks xmlns:a="http://schemas.openxmlformats.org/drawingml/2006/main" noChangeAspect="1"/>
+            </wp:cNvGraphicFramePr>
+            <a:graphic xmlns:a="http://schemas.openxmlformats.org/drawingml/2006/main">
+              <a:graphicData uri="http://schemas.openxmlformats.org/drawingml/2006/picture">
+                <pic:pic xmlns:pic="http://schemas.openxmlformats.org/drawingml/2006/picture">
+                  <pic:nvPicPr>
+                    <pic:cNvPr id="1" name=""/>
+                    <pic:cNvPicPr/>
+                  </pic:nvPicPr>
+                  <pic:blipFill>
+                    <a:blip r:embed="rId11"/>
+                    <a:stretch>
+                      <a:fillRect/>
+                    </a:stretch>
+                  </pic:blipFill>
+                  <pic:spPr>
+                    <a:xfrm>
+                      <a:off x="0" y="0"/>
+                      <a:ext cx="3029500" cy="3471643"/>
+                    </a:xfrm>
+                    <a:prstGeom prst="rect">
+                      <a:avLst/>
+                    </a:prstGeom>
+                  </pic:spPr>
+                </pic:pic>
+              </a:graphicData>
+            </a:graphic>
+          </wp:inline>
+        </w:drawing>
+      </w:r>
+    </w:p>
+    <w:p>
+      <w:pPr>
+        <w:pStyle w:val="a4"/>
+        <w:ind w:left="0" w:firstLine="0"/>
+        <w:jc w:val="center"/>
+      </w:pPr>
+      <w:r>
+        <w:t>Рисунок 6</w:t>
+      </w:r>
+      <w:r>
+        <w:t xml:space="preserve"> –</w:t>
+      </w:r>
+      <w:r>
+        <w:t xml:space="preserve"> Четвёртое</w:t>
+      </w:r>
+      <w:r>
+        <w:t xml:space="preserve"> значение</w:t>
+      </w:r>
+    </w:p>
+    <w:p>
+      <w:pPr>
+        <w:pStyle w:val="a4"/>
+        <w:ind w:left="0" w:firstLine="0"/>
+        <w:jc w:val="center"/>
+      </w:pPr>
+    </w:p>
+    <w:p>
+      <w:pPr>
+        <w:pStyle w:val="a4"/>
+        <w:ind w:left="0" w:firstLine="0"/>
+        <w:jc w:val="center"/>
+      </w:pPr>
+      <w:r>
+        <w:lastRenderedPageBreak/>
+        <w:drawing>
+          <wp:inline distT="0" distB="0" distL="0" distR="0" wp14:anchorId="53C94CBE" wp14:editId="4F873B9D">
+            <wp:extent cx="3094567" cy="3575195"/>
+            <wp:effectExtent l="0" t="0" r="0" b="6350"/>
+            <wp:docPr id="8" name="Рисунок 8"/>
+            <wp:cNvGraphicFramePr>
+              <a:graphicFrameLocks xmlns:a="http://schemas.openxmlformats.org/drawingml/2006/main" noChangeAspect="1"/>
+            </wp:cNvGraphicFramePr>
+            <a:graphic xmlns:a="http://schemas.openxmlformats.org/drawingml/2006/main">
+              <a:graphicData uri="http://schemas.openxmlformats.org/drawingml/2006/picture">
+                <pic:pic xmlns:pic="http://schemas.openxmlformats.org/drawingml/2006/picture">
+                  <pic:nvPicPr>
+                    <pic:cNvPr id="1" name=""/>
+                    <pic:cNvPicPr/>
+                  </pic:nvPicPr>
+                  <pic:blipFill>
+                    <a:blip r:embed="rId12"/>
+                    <a:stretch>
+                      <a:fillRect/>
+                    </a:stretch>
+                  </pic:blipFill>
+                  <pic:spPr>
+                    <a:xfrm>
+                      <a:off x="0" y="0"/>
+                      <a:ext cx="3111679" cy="3594965"/>
+                    </a:xfrm>
+                    <a:prstGeom prst="rect">
+                      <a:avLst/>
+                    </a:prstGeom>
+                  </pic:spPr>
+                </pic:pic>
+              </a:graphicData>
+            </a:graphic>
+          </wp:inline>
+        </w:drawing>
+      </w:r>
+    </w:p>
+    <w:p>
+      <w:pPr>
+        <w:pStyle w:val="a4"/>
+        <w:ind w:left="0" w:firstLine="0"/>
+        <w:jc w:val="center"/>
+      </w:pPr>
+      <w:r>
+        <w:t>Рисунок 7 – Вид кнопки, готовой выдать результат</w:t>
+      </w:r>
+    </w:p>
+    <w:p>
+      <w:pPr>
+        <w:pStyle w:val="a4"/>
+        <w:ind w:left="0" w:firstLine="0"/>
+        <w:jc w:val="center"/>
+      </w:pPr>
+    </w:p>
+    <w:p>
+      <w:pPr>
+        <w:pStyle w:val="a4"/>
+        <w:numPr>
+          <w:ilvl w:val="2"/>
+          <w:numId w:val="12"/>
+        </w:numPr>
+        <w:ind w:left="709" w:firstLine="709"/>
+      </w:pPr>
+      <w:r>
+        <w:t>Финальное нажатие на кнопку для получения результата</w:t>
+      </w:r>
+    </w:p>
+    <w:p>
+      <w:pPr>
+        <w:pStyle w:val="a4"/>
+        <w:ind w:left="0" w:firstLine="0"/>
+        <w:jc w:val="center"/>
+      </w:pPr>
+      <w:r>
+        <w:drawing>
+          <wp:inline distT="0" distB="0" distL="0" distR="0" wp14:anchorId="642470D6" wp14:editId="3F5735A2">
+            <wp:extent cx="3164422" cy="3674533"/>
+            <wp:effectExtent l="0" t="0" r="0" b="2540"/>
+            <wp:docPr id="9" name="Рисунок 9"/>
+            <wp:cNvGraphicFramePr>
+              <a:graphicFrameLocks xmlns:a="http://schemas.openxmlformats.org/drawingml/2006/main" noChangeAspect="1"/>
+            </wp:cNvGraphicFramePr>
+            <a:graphic xmlns:a="http://schemas.openxmlformats.org/drawingml/2006/main">
+              <a:graphicData uri="http://schemas.openxmlformats.org/drawingml/2006/picture">
+                <pic:pic xmlns:pic="http://schemas.openxmlformats.org/drawingml/2006/picture">
+                  <pic:nvPicPr>
+                    <pic:cNvPr id="1" name=""/>
+                    <pic:cNvPicPr/>
+                  </pic:nvPicPr>
+                  <pic:blipFill>
+                    <a:blip r:embed="rId13"/>
+                    <a:stretch>
+                      <a:fillRect/>
+                    </a:stretch>
+                  </pic:blipFill>
+                  <pic:spPr>
+                    <a:xfrm>
+                      <a:off x="0" y="0"/>
+                      <a:ext cx="3186671" cy="3700369"/>
+                    </a:xfrm>
+                    <a:prstGeom prst="rect">
+                      <a:avLst/>
+                    </a:prstGeom>
+                  </pic:spPr>
+                </pic:pic>
+              </a:graphicData>
+            </a:graphic>
+          </wp:inline>
+        </w:drawing>
+      </w:r>
+    </w:p>
+    <w:p>
+      <w:pPr>
+        <w:pStyle w:val="a4"/>
+        <w:ind w:left="0" w:firstLine="0"/>
+        <w:jc w:val="center"/>
+      </w:pPr>
+      <w:r>
+        <w:t>Рисунок 8</w:t>
+      </w:r>
+      <w:r>
+        <w:t xml:space="preserve"> –</w:t>
+      </w:r>
+      <w:r>
+        <w:t xml:space="preserve"> Результат вычислений</w:t>
+      </w:r>
+      <w:bookmarkStart w:id="0" w:name="_GoBack"/>
+      <w:bookmarkEnd w:id="0"/>
+    </w:p>
+    <w:p>
+      <w:pPr>
+        <w:pStyle w:val="a4"/>
+        <w:ind w:left="0" w:firstLine="0"/>
+        <w:jc w:val="center"/>
+      </w:pPr>
+    </w:p>
+    <w:p>
+      <w:pPr>
         <w:pStyle w:val="a4"/>
         <w:ind w:left="0" w:firstLine="0"/>
       </w:pPr>
@@ -223,6 +679,7 @@
         </w:numPr>
       </w:pPr>
       <w:r>
+        <w:lastRenderedPageBreak/>
         <w:t>Некоторые названия переменных в коде были изменены по теме.</w:t>
       </w:r>
     </w:p>
@@ -742,6 +1199,187 @@
       <w:lvlJc w:val="right"/>
       <w:pPr>
         <w:ind w:left="6829" w:hanging="180"/>
+      </w:pPr>
+    </w:lvl>
+  </w:abstractNum>
+  <w:abstractNum w:abstractNumId="4" w15:restartNumberingAfterBreak="0">
+    <w:nsid w:val="4FED7240"/>
+    <w:multiLevelType w:val="hybridMultilevel"/>
+    <w:tmpl w:val="D4CAD9C6"/>
+    <w:lvl w:ilvl="0" w:tplc="BF18ACA4">
+      <w:start w:val="1"/>
+      <w:numFmt w:val="decimal"/>
+      <w:lvlText w:val="1.%1."/>
+      <w:lvlJc w:val="left"/>
+      <w:pPr>
+        <w:ind w:left="1429" w:hanging="360"/>
+      </w:pPr>
+      <w:rPr>
+        <w:rFonts w:hint="default"/>
+      </w:rPr>
+    </w:lvl>
+    <w:lvl w:ilvl="1" w:tplc="04190019" w:tentative="1">
+      <w:start w:val="1"/>
+      <w:numFmt w:val="lowerLetter"/>
+      <w:lvlText w:val="%2."/>
+      <w:lvlJc w:val="left"/>
+      <w:pPr>
+        <w:ind w:left="1440" w:hanging="360"/>
+      </w:pPr>
+    </w:lvl>
+    <w:lvl w:ilvl="2" w:tplc="BF18ACA4">
+      <w:start w:val="1"/>
+      <w:numFmt w:val="decimal"/>
+      <w:lvlText w:val="1.%3."/>
+      <w:lvlJc w:val="left"/>
+      <w:pPr>
+        <w:ind w:left="2160" w:hanging="180"/>
+      </w:pPr>
+      <w:rPr>
+        <w:rFonts w:hint="default"/>
+      </w:rPr>
+    </w:lvl>
+    <w:lvl w:ilvl="3" w:tplc="0419000F" w:tentative="1">
+      <w:start w:val="1"/>
+      <w:numFmt w:val="decimal"/>
+      <w:lvlText w:val="%4."/>
+      <w:lvlJc w:val="left"/>
+      <w:pPr>
+        <w:ind w:left="2880" w:hanging="360"/>
+      </w:pPr>
+    </w:lvl>
+    <w:lvl w:ilvl="4" w:tplc="04190019" w:tentative="1">
+      <w:start w:val="1"/>
+      <w:numFmt w:val="lowerLetter"/>
+      <w:lvlText w:val="%5."/>
+      <w:lvlJc w:val="left"/>
+      <w:pPr>
+        <w:ind w:left="3600" w:hanging="360"/>
+      </w:pPr>
+    </w:lvl>
+    <w:lvl w:ilvl="5" w:tplc="0419001B" w:tentative="1">
+      <w:start w:val="1"/>
+      <w:numFmt w:val="lowerRoman"/>
+      <w:lvlText w:val="%6."/>
+      <w:lvlJc w:val="right"/>
+      <w:pPr>
+        <w:ind w:left="4320" w:hanging="180"/>
+      </w:pPr>
+    </w:lvl>
+    <w:lvl w:ilvl="6" w:tplc="0419000F" w:tentative="1">
+      <w:start w:val="1"/>
+      <w:numFmt w:val="decimal"/>
+      <w:lvlText w:val="%7."/>
+      <w:lvlJc w:val="left"/>
+      <w:pPr>
+        <w:ind w:left="5040" w:hanging="360"/>
+      </w:pPr>
+    </w:lvl>
+    <w:lvl w:ilvl="7" w:tplc="04190019" w:tentative="1">
+      <w:start w:val="1"/>
+      <w:numFmt w:val="lowerLetter"/>
+      <w:lvlText w:val="%8."/>
+      <w:lvlJc w:val="left"/>
+      <w:pPr>
+        <w:ind w:left="5760" w:hanging="360"/>
+      </w:pPr>
+    </w:lvl>
+    <w:lvl w:ilvl="8" w:tplc="0419001B" w:tentative="1">
+      <w:start w:val="1"/>
+      <w:numFmt w:val="lowerRoman"/>
+      <w:lvlText w:val="%9."/>
+      <w:lvlJc w:val="right"/>
+      <w:pPr>
+        <w:ind w:left="6480" w:hanging="180"/>
+      </w:pPr>
+    </w:lvl>
+  </w:abstractNum>
+  <w:abstractNum w:abstractNumId="5" w15:restartNumberingAfterBreak="0">
+    <w:nsid w:val="5AF942DE"/>
+    <w:multiLevelType w:val="hybridMultilevel"/>
+    <w:tmpl w:val="150A601A"/>
+    <w:lvl w:ilvl="0" w:tplc="3286BAA6">
+      <w:start w:val="1"/>
+      <w:numFmt w:val="decimal"/>
+      <w:lvlText w:val="%1."/>
+      <w:lvlJc w:val="left"/>
+      <w:pPr>
+        <w:ind w:left="1429" w:hanging="360"/>
+      </w:pPr>
+      <w:rPr>
+        <w:rFonts w:hint="default"/>
+      </w:rPr>
+    </w:lvl>
+    <w:lvl w:ilvl="1" w:tplc="04190019" w:tentative="1">
+      <w:start w:val="1"/>
+      <w:numFmt w:val="lowerLetter"/>
+      <w:lvlText w:val="%2."/>
+      <w:lvlJc w:val="left"/>
+      <w:pPr>
+        <w:ind w:left="2149" w:hanging="360"/>
+      </w:pPr>
+    </w:lvl>
+    <w:lvl w:ilvl="2" w:tplc="0419001B" w:tentative="1">
+      <w:start w:val="1"/>
+      <w:numFmt w:val="lowerRoman"/>
+      <w:lvlText w:val="%3."/>
+      <w:lvlJc w:val="right"/>
+      <w:pPr>
+        <w:ind w:left="2869" w:hanging="180"/>
+      </w:pPr>
+    </w:lvl>
+    <w:lvl w:ilvl="3" w:tplc="0419000F" w:tentative="1">
+      <w:start w:val="1"/>
+      <w:numFmt w:val="decimal"/>
+      <w:lvlText w:val="%4."/>
+      <w:lvlJc w:val="left"/>
+      <w:pPr>
+        <w:ind w:left="3589" w:hanging="360"/>
+      </w:pPr>
+    </w:lvl>
+    <w:lvl w:ilvl="4" w:tplc="04190019" w:tentative="1">
+      <w:start w:val="1"/>
+      <w:numFmt w:val="lowerLetter"/>
+      <w:lvlText w:val="%5."/>
+      <w:lvlJc w:val="left"/>
+      <w:pPr>
+        <w:ind w:left="4309" w:hanging="360"/>
+      </w:pPr>
+    </w:lvl>
+    <w:lvl w:ilvl="5" w:tplc="0419001B" w:tentative="1">
+      <w:start w:val="1"/>
+      <w:numFmt w:val="lowerRoman"/>
+      <w:lvlText w:val="%6."/>
+      <w:lvlJc w:val="right"/>
+      <w:pPr>
+        <w:ind w:left="5029" w:hanging="180"/>
+      </w:pPr>
+    </w:lvl>
+    <w:lvl w:ilvl="6" w:tplc="0419000F" w:tentative="1">
+      <w:start w:val="1"/>
+      <w:numFmt w:val="decimal"/>
+      <w:lvlText w:val="%7."/>
+      <w:lvlJc w:val="left"/>
+      <w:pPr>
+        <w:ind w:left="5749" w:hanging="360"/>
+      </w:pPr>
+    </w:lvl>
+    <w:lvl w:ilvl="7" w:tplc="04190019" w:tentative="1">
+      <w:start w:val="1"/>
+      <w:numFmt w:val="lowerLetter"/>
+      <w:lvlText w:val="%8."/>
+      <w:lvlJc w:val="left"/>
+      <w:pPr>
+        <w:ind w:left="6469" w:hanging="360"/>
+      </w:pPr>
+    </w:lvl>
+    <w:lvl w:ilvl="8" w:tplc="0419001B" w:tentative="1">
+      <w:start w:val="1"/>
+      <w:numFmt w:val="lowerRoman"/>
+      <w:lvlText w:val="%9."/>
+      <w:lvlJc w:val="right"/>
+      <w:pPr>
+        <w:ind w:left="7189" w:hanging="180"/>
       </w:pPr>
     </w:lvl>
   </w:abstractNum>
@@ -774,6 +1412,12 @@
   </w:num>
   <w:num w:numId="10">
     <w:abstractNumId w:val="3"/>
+  </w:num>
+  <w:num w:numId="11">
+    <w:abstractNumId w:val="5"/>
+  </w:num>
+  <w:num w:numId="12">
+    <w:abstractNumId w:val="4"/>
   </w:num>
 </w:numbering>
 </file>

</xml_diff>